<commit_message>
Atualizando modelo da ficha
</commit_message>
<xml_diff>
--- a/ficha.docx
+++ b/ficha.docx
@@ -641,7 +641,31 @@
           <w:b w:val="false"/>
           <w:bCs w:val="false"/>
         </w:rPr>
-        <w:t xml:space="preserve"> {{email}}</w:t>
+        <w:t xml:space="preserve"> {{e-mail}}</w:t>
+      </w:r>
+      <w:r>
+        <w:rPr>
+          <w:rFonts w:eastAsia="Arial" w:cs="Arial" w:cstheme="minorAscii" w:eastAsiaTheme="minorAscii"/>
+          <w:b w:val="false"/>
+          <w:bCs w:val="false"/>
+        </w:rPr>
+        <w:t xml:space="preserve"> | </w:t>
+      </w:r>
+      <w:r>
+        <w:rPr>
+          <w:rFonts w:eastAsia="Arial" w:cs="Arial" w:cstheme="minorAscii" w:eastAsiaTheme="minorAscii"/>
+          <w:b/>
+          <w:bCs/>
+        </w:rPr>
+        <w:t xml:space="preserve">TELEFONE: </w:t>
+      </w:r>
+      <w:r>
+        <w:rPr>
+          <w:rFonts w:eastAsia="Arial" w:cs="Arial" w:cstheme="minorAscii" w:eastAsiaTheme="minorAscii"/>
+          <w:b w:val="false"/>
+          <w:bCs w:val="false"/>
+        </w:rPr>
+        <w:t>{{telefone}}</w:t>
       </w:r>
     </w:p>
     <w:p>
@@ -922,8 +946,8 @@
     </w:tblPr>
     <w:tblGrid>
       <w:gridCol w:w="450"/>
-      <w:gridCol w:w="10770"/>
-      <w:gridCol w:w="390"/>
+      <w:gridCol w:w="10769"/>
+      <w:gridCol w:w="391"/>
     </w:tblGrid>
     <w:tr>
       <w:trPr>
@@ -938,6 +962,7 @@
           <w:pPr>
             <w:pStyle w:val="Header"/>
             <w:widowControl/>
+            <w:suppressAutoHyphens w:val="true"/>
             <w:bidi w:val="0"/>
             <w:spacing w:before="0" w:after="0"/>
             <w:ind w:left="-115"/>
@@ -963,13 +988,14 @@
       </w:tc>
       <w:tc>
         <w:tcPr>
-          <w:tcW w:w="10770" w:type="dxa"/>
+          <w:tcW w:w="10769" w:type="dxa"/>
           <w:tcBorders/>
         </w:tcPr>
         <w:p>
           <w:pPr>
             <w:pStyle w:val="Header"/>
             <w:widowControl/>
+            <w:suppressAutoHyphens w:val="true"/>
             <w:bidi w:val="0"/>
             <w:spacing w:before="0" w:after="0"/>
             <w:jc w:val="center"/>
@@ -1005,13 +1031,14 @@
       </w:tc>
       <w:tc>
         <w:tcPr>
-          <w:tcW w:w="390" w:type="dxa"/>
+          <w:tcW w:w="391" w:type="dxa"/>
           <w:tcBorders/>
         </w:tcPr>
         <w:p>
           <w:pPr>
             <w:pStyle w:val="Header"/>
             <w:widowControl/>
+            <w:suppressAutoHyphens w:val="true"/>
             <w:bidi w:val="0"/>
             <w:spacing w:before="0" w:after="0"/>
             <w:ind w:right="-115"/>
@@ -1069,8 +1096,8 @@
     </w:tblPr>
     <w:tblGrid>
       <w:gridCol w:w="450"/>
-      <w:gridCol w:w="10770"/>
-      <w:gridCol w:w="390"/>
+      <w:gridCol w:w="10769"/>
+      <w:gridCol w:w="391"/>
     </w:tblGrid>
     <w:tr>
       <w:trPr>
@@ -1085,6 +1112,7 @@
           <w:pPr>
             <w:pStyle w:val="Header"/>
             <w:widowControl/>
+            <w:suppressAutoHyphens w:val="true"/>
             <w:bidi w:val="0"/>
             <w:spacing w:before="0" w:after="0"/>
             <w:ind w:left="-115"/>
@@ -1110,13 +1138,14 @@
       </w:tc>
       <w:tc>
         <w:tcPr>
-          <w:tcW w:w="10770" w:type="dxa"/>
+          <w:tcW w:w="10769" w:type="dxa"/>
           <w:tcBorders/>
         </w:tcPr>
         <w:p>
           <w:pPr>
             <w:pStyle w:val="Header"/>
             <w:widowControl/>
+            <w:suppressAutoHyphens w:val="true"/>
             <w:bidi w:val="0"/>
             <w:spacing w:before="0" w:after="0"/>
             <w:jc w:val="center"/>
@@ -1152,13 +1181,14 @@
       </w:tc>
       <w:tc>
         <w:tcPr>
-          <w:tcW w:w="390" w:type="dxa"/>
+          <w:tcW w:w="391" w:type="dxa"/>
           <w:tcBorders/>
         </w:tcPr>
         <w:p>
           <w:pPr>
             <w:pStyle w:val="Header"/>
             <w:widowControl/>
+            <w:suppressAutoHyphens w:val="true"/>
             <w:bidi w:val="0"/>
             <w:spacing w:before="0" w:after="0"/>
             <w:ind w:right="-115"/>
@@ -1230,8 +1260,8 @@
     </w:tblPr>
     <w:tblGrid>
       <w:gridCol w:w="4560"/>
-      <w:gridCol w:w="2595"/>
-      <w:gridCol w:w="4245"/>
+      <w:gridCol w:w="2594"/>
+      <w:gridCol w:w="4246"/>
     </w:tblGrid>
     <w:tr>
       <w:trPr>
@@ -1250,6 +1280,7 @@
           <w:pPr>
             <w:pStyle w:val="Header"/>
             <w:widowControl/>
+            <w:suppressAutoHyphens w:val="true"/>
             <w:bidi w:val="0"/>
             <w:spacing w:before="0" w:after="0"/>
             <w:ind w:left="-115"/>
@@ -1276,7 +1307,7 @@
       </w:tc>
       <w:tc>
         <w:tcPr>
-          <w:tcW w:w="2595" w:type="dxa"/>
+          <w:tcW w:w="2594" w:type="dxa"/>
           <w:tcBorders>
             <w:top w:val="double" w:sz="4" w:space="0" w:color="000000"/>
             <w:bottom w:val="double" w:sz="4" w:space="0" w:color="000000"/>
@@ -1286,6 +1317,7 @@
           <w:pPr>
             <w:pStyle w:val="Header"/>
             <w:widowControl/>
+            <w:suppressAutoHyphens w:val="true"/>
             <w:bidi w:val="0"/>
             <w:spacing w:before="0" w:after="0"/>
             <w:jc w:val="center"/>
@@ -1310,7 +1342,7 @@
       </w:tc>
       <w:tc>
         <w:tcPr>
-          <w:tcW w:w="4245" w:type="dxa"/>
+          <w:tcW w:w="4246" w:type="dxa"/>
           <w:tcBorders>
             <w:top w:val="double" w:sz="4" w:space="0" w:color="000000"/>
             <w:bottom w:val="double" w:sz="4" w:space="0" w:color="000000"/>
@@ -1321,6 +1353,7 @@
           <w:pPr>
             <w:pStyle w:val="Header"/>
             <w:widowControl/>
+            <w:suppressAutoHyphens w:val="true"/>
             <w:bidi w:val="0"/>
             <w:spacing w:before="0" w:after="0"/>
             <w:ind w:right="-115"/>
@@ -1384,8 +1417,8 @@
     </w:tblPr>
     <w:tblGrid>
       <w:gridCol w:w="4560"/>
-      <w:gridCol w:w="2595"/>
-      <w:gridCol w:w="4245"/>
+      <w:gridCol w:w="2594"/>
+      <w:gridCol w:w="4246"/>
     </w:tblGrid>
     <w:tr>
       <w:trPr>
@@ -1404,6 +1437,7 @@
           <w:pPr>
             <w:pStyle w:val="Header"/>
             <w:widowControl/>
+            <w:suppressAutoHyphens w:val="true"/>
             <w:bidi w:val="0"/>
             <w:spacing w:before="0" w:after="0"/>
             <w:ind w:left="-115"/>
@@ -1430,7 +1464,7 @@
       </w:tc>
       <w:tc>
         <w:tcPr>
-          <w:tcW w:w="2595" w:type="dxa"/>
+          <w:tcW w:w="2594" w:type="dxa"/>
           <w:tcBorders>
             <w:top w:val="double" w:sz="4" w:space="0" w:color="000000"/>
             <w:bottom w:val="double" w:sz="4" w:space="0" w:color="000000"/>
@@ -1440,6 +1474,7 @@
           <w:pPr>
             <w:pStyle w:val="Header"/>
             <w:widowControl/>
+            <w:suppressAutoHyphens w:val="true"/>
             <w:bidi w:val="0"/>
             <w:spacing w:before="0" w:after="0"/>
             <w:jc w:val="center"/>
@@ -1464,7 +1499,7 @@
       </w:tc>
       <w:tc>
         <w:tcPr>
-          <w:tcW w:w="4245" w:type="dxa"/>
+          <w:tcW w:w="4246" w:type="dxa"/>
           <w:tcBorders>
             <w:top w:val="double" w:sz="4" w:space="0" w:color="000000"/>
             <w:bottom w:val="double" w:sz="4" w:space="0" w:color="000000"/>
@@ -1475,6 +1510,7 @@
           <w:pPr>
             <w:pStyle w:val="Header"/>
             <w:widowControl/>
+            <w:suppressAutoHyphens w:val="true"/>
             <w:bidi w:val="0"/>
             <w:spacing w:before="0" w:after="0"/>
             <w:ind w:right="-115"/>
@@ -1914,8 +1950,9 @@
     <w:qFormat/>
     <w:pPr>
       <w:widowControl/>
+      <w:suppressAutoHyphens w:val="true"/>
       <w:bidi w:val="0"/>
-      <w:spacing w:lineRule="auto" w:line="278" w:before="0" w:after="160"/>
+      <w:spacing w:lineRule="auto" w:line="276" w:before="0" w:after="160"/>
       <w:jc w:val="left"/>
     </w:pPr>
     <w:rPr>

</xml_diff>